<commit_message>
1st document of ISMS
</commit_message>
<xml_diff>
--- a/ISMS scope.docx
+++ b/ISMS scope.docx
@@ -61,7 +61,7 @@
           <w:szCs w:val="24"/>
           <w:lang w:eastAsia="en-IN"/>
         </w:rPr>
-        <w:t>Jupiter Federal Bank</w:t>
+        <w:t>Secure Trust Bank</w:t>
       </w:r>
       <w:r>
         <w:rPr>
@@ -136,7 +136,17 @@
           <w:szCs w:val="24"/>
           <w:lang w:eastAsia="en-IN"/>
         </w:rPr>
-        <w:t>Jupiter Federal Bank is a digital banking and financial services organization providing:</w:t>
+        <w:t>Secure Trust Bank</w:t>
+      </w:r>
+      <w:r>
+        <w:rPr>
+          <w:rFonts w:eastAsia="Times New Roman" w:cstheme="minorHAnsi"/>
+          <w:color w:val="222222"/>
+          <w:sz w:val="24"/>
+          <w:szCs w:val="24"/>
+          <w:lang w:eastAsia="en-IN"/>
+        </w:rPr>
+        <w:t xml:space="preserve"> is a digital banking and financial services organization providing:</w:t>
       </w:r>
     </w:p>
     <w:p>
@@ -336,7 +346,27 @@
           <w:szCs w:val="24"/>
           <w:lang w:eastAsia="en-IN"/>
         </w:rPr>
-        <w:t xml:space="preserve">The ISMS of Jupiter Federal Bank </w:t>
+        <w:t xml:space="preserve">The ISMS of </w:t>
+      </w:r>
+      <w:r>
+        <w:rPr>
+          <w:rFonts w:eastAsia="Times New Roman" w:cstheme="minorHAnsi"/>
+          <w:color w:val="222222"/>
+          <w:sz w:val="24"/>
+          <w:szCs w:val="24"/>
+          <w:lang w:eastAsia="en-IN"/>
+        </w:rPr>
+        <w:t>Secure Trust Bank</w:t>
+      </w:r>
+      <w:r>
+        <w:rPr>
+          <w:rFonts w:eastAsia="Times New Roman" w:cstheme="minorHAnsi"/>
+          <w:color w:val="222222"/>
+          <w:sz w:val="24"/>
+          <w:szCs w:val="24"/>
+          <w:lang w:eastAsia="en-IN"/>
+        </w:rPr>
+        <w:t xml:space="preserve"> </w:t>
       </w:r>
       <w:proofErr w:type="gramStart"/>
       <w:r>
@@ -1363,7 +1393,17 @@
           <w:szCs w:val="24"/>
           <w:lang w:eastAsia="en-IN"/>
         </w:rPr>
-        <w:t>Third-party systems not directly managed or controlled by Jupiter Federal Bank</w:t>
+        <w:t xml:space="preserve">Third-party systems not directly managed or controlled by </w:t>
+      </w:r>
+      <w:r>
+        <w:rPr>
+          <w:rFonts w:eastAsia="Times New Roman" w:cstheme="minorHAnsi"/>
+          <w:color w:val="222222"/>
+          <w:sz w:val="24"/>
+          <w:szCs w:val="24"/>
+          <w:lang w:eastAsia="en-IN"/>
+        </w:rPr>
+        <w:t>Secure Trust Bank</w:t>
       </w:r>
     </w:p>
     <w:p>
@@ -4746,6 +4786,7 @@
   <w:style w:type="character" w:default="1" w:styleId="DefaultParagraphFont">
     <w:name w:val="Default Paragraph Font"/>
     <w:uiPriority w:val="1"/>
+    <w:semiHidden/>
     <w:unhideWhenUsed/>
   </w:style>
   <w:style w:type="table" w:default="1" w:styleId="TableNormal">

</xml_diff>